<commit_message>
Gewählter Lösungsweg für Backend und Login
</commit_message>
<xml_diff>
--- a/Dokumentation.docx
+++ b/Dokumentation.docx
@@ -3436,16 +3436,36 @@
       <w:pPr>
         <w:jc w:val="both"/>
         <w:rPr>
-          <w:sz w:val="22"/>
-          <w:szCs w:val="22"/>
-        </w:rPr>
-      </w:pPr>
-      <w:r>
-        <w:rPr>
-          <w:sz w:val="22"/>
-          <w:szCs w:val="22"/>
-        </w:rPr>
-        <w:t xml:space="preserve">Elio - erklären auf was für Techniken gesetzt wurde. Nicht nur Java und </w:t>
+          <w:b/>
+          <w:bCs/>
+          <w:sz w:val="22"/>
+          <w:szCs w:val="22"/>
+        </w:rPr>
+      </w:pPr>
+      <w:r>
+        <w:rPr>
+          <w:b/>
+          <w:bCs/>
+          <w:sz w:val="22"/>
+          <w:szCs w:val="22"/>
+        </w:rPr>
+        <w:t>Gewählte Lösungsvariante:</w:t>
+      </w:r>
+    </w:p>
+    <w:p>
+      <w:pPr>
+        <w:jc w:val="both"/>
+        <w:rPr>
+          <w:sz w:val="22"/>
+          <w:szCs w:val="22"/>
+        </w:rPr>
+      </w:pPr>
+      <w:r>
+        <w:rPr>
+          <w:sz w:val="22"/>
+          <w:szCs w:val="22"/>
+        </w:rPr>
+        <w:t xml:space="preserve">Wir haben uns für Java mit </w:t>
       </w:r>
       <w:proofErr w:type="spellStart"/>
       <w:r>
@@ -3461,7 +3481,15 @@
           <w:sz w:val="22"/>
           <w:szCs w:val="22"/>
         </w:rPr>
-        <w:t>, sondern wie die Weiterleitung auf die richtige Seite funktioniert und nur mit korrektem Login erfolgt.</w:t>
+        <w:t xml:space="preserve"> entschieden. Der ausschlaggebende Punkt war die vorhandene Erfahrung. Da die Projektzeit kurz ist, wäre es zu riskant gewesen, eine komplett neue Sprache zu lernen.</w:t>
+      </w:r>
+      <w:r>
+        <w:rPr>
+          <w:sz w:val="22"/>
+          <w:szCs w:val="22"/>
+        </w:rPr>
+        <w:br/>
+        <w:t>Für das Login wird JWT eingesetzt. Nach einem erfolgreichen Login gibt das Backend ein signiertes Token zurück, den der Browser speichert. Bei jeder weiteren Anfrage wird dieses Token mitgeschickt. Nur wenn das Token richtig ist, wird die angeforderte Seite freigegeben.</w:t>
       </w:r>
     </w:p>
     <w:p>
@@ -3477,7 +3505,7 @@
           <w:sz w:val="22"/>
           <w:szCs w:val="22"/>
         </w:rPr>
-        <w:t>Registrierungsfunktion ist praktisch und einfacher als gedacht Elio, falls Registrierung trotzdem eingebaut.</w:t>
+        <w:t>Die Registrierung wird auch umgesetzt da sie einfacher als erwartet ist.</w:t>
       </w:r>
     </w:p>
     <w:p>
@@ -8447,6 +8475,7 @@
   <w:style w:type="character" w:default="1" w:styleId="Absatz-Standardschriftart">
     <w:name w:val="Default Paragraph Font"/>
     <w:uiPriority w:val="1"/>
+    <w:semiHidden/>
     <w:unhideWhenUsed/>
   </w:style>
   <w:style w:type="table" w:default="1" w:styleId="NormaleTabelle">
@@ -9196,12 +9225,21 @@
 </file>
 
 <file path=customXml/item1.xml><?xml version="1.0" encoding="utf-8"?>
-<?mso-contentType ?>
-<FormTemplates xmlns="http://schemas.microsoft.com/sharepoint/v3/contenttype/forms">
-  <Display>DocumentLibraryForm</Display>
-  <Edit>DocumentLibraryForm</Edit>
-  <New>DocumentLibraryForm</New>
-</FormTemplates>
+<p:properties xmlns:p="http://schemas.microsoft.com/office/2006/metadata/properties" xmlns:xsi="http://www.w3.org/2001/XMLSchema-instance" xmlns:pc="http://schemas.microsoft.com/office/infopath/2007/PartnerControls">
+  <documentManagement>
+    <SharedWithUsers xmlns="8e922e2c-d434-4569-88ac-67afeec8ca9b">
+      <UserInfo>
+        <DisplayName>BBZW;; Kirchhoffer Nathalie (Lehrperson)</DisplayName>
+        <AccountId>22</AccountId>
+        <AccountType/>
+      </UserInfo>
+    </SharedWithUsers>
+    <lcf76f155ced4ddcb4097134ff3c332f xmlns="08a37d9d-9576-4bab-89c6-ad9e0707cb90">
+      <Terms xmlns="http://schemas.microsoft.com/office/infopath/2007/PartnerControls"/>
+    </lcf76f155ced4ddcb4097134ff3c332f>
+    <TaxCatchAll xmlns="8e922e2c-d434-4569-88ac-67afeec8ca9b" xsi:nil="true"/>
+  </documentManagement>
+</p:properties>
 </file>
 
 <file path=customXml/item2.xml><?xml version="1.0" encoding="utf-8"?>
@@ -9434,21 +9472,12 @@
 </file>
 
 <file path=customXml/item3.xml><?xml version="1.0" encoding="utf-8"?>
-<p:properties xmlns:p="http://schemas.microsoft.com/office/2006/metadata/properties" xmlns:xsi="http://www.w3.org/2001/XMLSchema-instance" xmlns:pc="http://schemas.microsoft.com/office/infopath/2007/PartnerControls">
-  <documentManagement>
-    <SharedWithUsers xmlns="8e922e2c-d434-4569-88ac-67afeec8ca9b">
-      <UserInfo>
-        <DisplayName>BBZW;; Kirchhoffer Nathalie (Lehrperson)</DisplayName>
-        <AccountId>22</AccountId>
-        <AccountType/>
-      </UserInfo>
-    </SharedWithUsers>
-    <lcf76f155ced4ddcb4097134ff3c332f xmlns="08a37d9d-9576-4bab-89c6-ad9e0707cb90">
-      <Terms xmlns="http://schemas.microsoft.com/office/infopath/2007/PartnerControls"/>
-    </lcf76f155ced4ddcb4097134ff3c332f>
-    <TaxCatchAll xmlns="8e922e2c-d434-4569-88ac-67afeec8ca9b" xsi:nil="true"/>
-  </documentManagement>
-</p:properties>
+<?mso-contentType ?>
+<FormTemplates xmlns="http://schemas.microsoft.com/sharepoint/v3/contenttype/forms">
+  <Display>DocumentLibraryForm</Display>
+  <Edit>DocumentLibraryForm</Edit>
+  <New>DocumentLibraryForm</New>
+</FormTemplates>
 </file>
 
 <file path=customXml/item4.xml><?xml version="1.0" encoding="utf-8"?>
@@ -9456,9 +9485,12 @@
 </file>
 
 <file path=customXml/itemProps1.xml><?xml version="1.0" encoding="utf-8"?>
-<ds:datastoreItem xmlns:ds="http://schemas.openxmlformats.org/officeDocument/2006/customXml" ds:itemID="{71DE08F4-B35B-4C83-9D9E-CD46B5CA120D}">
+<ds:datastoreItem xmlns:ds="http://schemas.openxmlformats.org/officeDocument/2006/customXml" ds:itemID="{44A69993-750B-47D0-8AB0-0BA0A3A4FBDB}">
   <ds:schemaRefs>
-    <ds:schemaRef ds:uri="http://schemas.microsoft.com/sharepoint/v3/contenttype/forms"/>
+    <ds:schemaRef ds:uri="http://schemas.microsoft.com/office/2006/metadata/properties"/>
+    <ds:schemaRef ds:uri="http://schemas.microsoft.com/office/infopath/2007/PartnerControls"/>
+    <ds:schemaRef ds:uri="8e922e2c-d434-4569-88ac-67afeec8ca9b"/>
+    <ds:schemaRef ds:uri="08a37d9d-9576-4bab-89c6-ad9e0707cb90"/>
   </ds:schemaRefs>
 </ds:datastoreItem>
 </file>
@@ -9483,12 +9515,9 @@
 </file>
 
 <file path=customXml/itemProps3.xml><?xml version="1.0" encoding="utf-8"?>
-<ds:datastoreItem xmlns:ds="http://schemas.openxmlformats.org/officeDocument/2006/customXml" ds:itemID="{44A69993-750B-47D0-8AB0-0BA0A3A4FBDB}">
+<ds:datastoreItem xmlns:ds="http://schemas.openxmlformats.org/officeDocument/2006/customXml" ds:itemID="{71DE08F4-B35B-4C83-9D9E-CD46B5CA120D}">
   <ds:schemaRefs>
-    <ds:schemaRef ds:uri="http://schemas.microsoft.com/office/2006/metadata/properties"/>
-    <ds:schemaRef ds:uri="http://schemas.microsoft.com/office/infopath/2007/PartnerControls"/>
-    <ds:schemaRef ds:uri="8e922e2c-d434-4569-88ac-67afeec8ca9b"/>
-    <ds:schemaRef ds:uri="08a37d9d-9576-4bab-89c6-ad9e0707cb90"/>
+    <ds:schemaRef ds:uri="http://schemas.microsoft.com/sharepoint/v3/contenttype/forms"/>
   </ds:schemaRefs>
 </ds:datastoreItem>
 </file>

</xml_diff>